<commit_message>
Updated the evidence and test report with some timer correction
</commit_message>
<xml_diff>
--- a/Evidence/Test reports for Async field validation while editing.docx
+++ b/Evidence/Test reports for Async field validation while editing.docx
@@ -537,6 +537,70 @@
               </w:rPr>
             </w:pPr>
             <w:hyperlink r:id="rId15" w:history="1">
+              <w:r>
+                <w:rPr>
+                  <w:rStyle w:val="Hyperlink"/>
+                </w:rPr>
+                <w:t>WASM</w:t>
+              </w:r>
+            </w:hyperlink>
+          </w:p>
+        </w:tc>
+      </w:tr>
+      <w:tr>
+        <w:tc>
+          <w:tcPr>
+            <w:tcW w:w="3116" w:type="dxa"/>
+          </w:tcPr>
+          <w:p>
+            <w:r>
+              <w:t xml:space="preserve">A later, faster username validation overtakes the original slower validation. After entering </w:t>
+            </w:r>
+            <w:proofErr w:type="spellStart"/>
+            <w:r>
+              <w:t>takenuser</w:t>
+            </w:r>
+            <w:proofErr w:type="spellEnd"/>
+            <w:r>
+              <w:t xml:space="preserve"> and replacing it with </w:t>
+            </w:r>
+            <w:proofErr w:type="spellStart"/>
+            <w:r>
+              <w:t>newuser</w:t>
+            </w:r>
+            <w:proofErr w:type="spellEnd"/>
+            <w:r>
+              <w:t>, the faster replacement completes before the original five-second deadline. After that deadline passes, no stale error from the original validation appears.</w:t>
+            </w:r>
+          </w:p>
+        </w:tc>
+        <w:tc>
+          <w:tcPr>
+            <w:tcW w:w="3117" w:type="dxa"/>
+          </w:tcPr>
+          <w:p>
+            <w:r>
+              <w:t>Pass</w:t>
+            </w:r>
+          </w:p>
+        </w:tc>
+        <w:tc>
+          <w:tcPr>
+            <w:tcW w:w="3117" w:type="dxa"/>
+          </w:tcPr>
+          <w:p>
+            <w:hyperlink r:id="rId16" w:history="1">
+              <w:r>
+                <w:rPr>
+                  <w:rStyle w:val="Hyperlink"/>
+                </w:rPr>
+                <w:t>Server</w:t>
+              </w:r>
+            </w:hyperlink>
+          </w:p>
+          <w:p/>
+          <w:p>
+            <w:hyperlink r:id="rId17" w:history="1">
               <w:r>
                 <w:rPr>
                   <w:rStyle w:val="Hyperlink"/>

</xml_diff>